<commit_message>
Herald audition, minor dance tweaks, SVG WWWC logo
Fixed the Herald audition and minor dance tweaks, made SVG file of the WWWC logo
</commit_message>
<xml_diff>
--- a/howTo26/dance/The Company Way choreography.docx
+++ b/howTo26/dance/The Company Way choreography.docx
@@ -97,7 +97,19 @@
         <w:spacing w:line="240" w:lineRule="auto"/>
       </w:pPr>
       <w:r>
-        <w:t>When Bud sings “pride” put right fist at your heart.  Put your fist down on “in</w:t>
+        <w:t xml:space="preserve">When </w:t>
+      </w:r>
+      <w:r>
+        <w:t>you</w:t>
+      </w:r>
+      <w:r>
+        <w:t xml:space="preserve"> sing “pride” put right fist at your heart.  Put your fist down </w:t>
+      </w:r>
+      <w:r>
+        <w:t>when Bud sings</w:t>
+      </w:r>
+      <w:r>
+        <w:t xml:space="preserve"> “in</w:t>
       </w:r>
       <w:r>
         <w:rPr>
@@ -257,13 +269,7 @@
         <w:t>F</w:t>
       </w:r>
       <w:r>
-        <w:t xml:space="preserve">: Caroline crosses </w:t>
-      </w:r>
-      <w:r>
-        <w:t>stage right</w:t>
-      </w:r>
-      <w:r>
-        <w:t xml:space="preserve"> in front of Bud. </w:t>
+        <w:t xml:space="preserve">: Caroline crosses stage right in front of Bud. </w:t>
       </w:r>
       <w:r>
         <w:t>Stand</w:t>
@@ -892,6 +898,7 @@
         <w:spacing w:line="240" w:lineRule="auto"/>
       </w:pPr>
       <w:r>
+        <w:lastRenderedPageBreak/>
         <w:t xml:space="preserve">Raise both hands toward Bud on “way”. </w:t>
       </w:r>
       <w:r>

</xml_diff>